<commit_message>
Ampliar las instrucciones semanales: ejecucion, informe, metricas y preguntas
Cada documento Word ahora integra: preparacion del entorno paso a paso
(resumen del MANUAL), ejecucion detallada por fases con los comandos
exactos, estructura obligatoria del informe semanal, tablas de
metricas con los valores de referencia del docente como linea base a
superar (F1/latencia de MIMIC, Recall@K/MRR por ruta y hallazgos del
ablation de MATCH, experimento de ventanas del timeline de ASK),
cinco preguntas finales de defensa por semana, y cuatro mejoras
opcionales por semana que suben nota (class_weight, fusion ponderada
de scores, histeresis, tracking entre keyframes, entre otras).

Co-Authored-By: Claude Fable 5 <noreply@anthropic.com>
</commit_message>
<xml_diff>
--- a/docs/instrucciones/Instrucciones_Semana_1_MIMIC.docx
+++ b/docs/instrucciones/Instrucciones_Semana_1_MIMIC.docx
@@ -28,7 +28,7 @@
     </w:p>
     <w:p>
       <w:r>
-        <w:t>Partir del pipeline de referencia del docente y reemplazar su dataset publico por capturas propias con webcam. La solucion de referencia tiene una limitacion documentada a proposito: sus clases curadas tienen entre 7 y 16 fotos, muy por debajo del minimo recomendado, y eso produce un clasificador sesgado (ver docs/informe_D1_mimic.md del repositorio). El trabajo del equipo es demostrar, con numeros, cuanto mejora el sistema cuando se entrena con datos propios bien capturados.</w:t>
+        <w:t>Partir del pipeline de referencia del docente y reemplazar su dataset publico por capturas propias con webcam. La solucion de referencia tiene una limitacion documentada a proposito: sus 8 clases curadas tienen entre 7 y 16 fotos, muy por debajo del minimo recomendado de 100, y eso produce un clasificador sesgado hacia las clases grandes (ver docs/informe_D1_mimic.md). El trabajo del equipo es demostrar, con numeros, cuanto mejora el sistema cuando se entrena con datos propios bien capturados.</w:t>
       </w:r>
     </w:p>
     <w:p>
@@ -36,7 +36,12 @@
         <w:pStyle w:val="Heading1"/>
       </w:pPr>
       <w:r>
-        <w:t>Pasos</w:t>
+        <w:t>A. Preparacion del entorno (una sola vez)</w:t>
+      </w:r>
+    </w:p>
+    <w:p>
+      <w:r>
+        <w:t>Estos pasos se hacen una unica vez por integrante. La guia extendida con solucion de problemas esta en docs/MANUAL.md del repositorio.</w:t>
       </w:r>
     </w:p>
     <w:p>
@@ -47,7 +52,7 @@
         <w:t xml:space="preserve">Paso 1. </w:t>
       </w:r>
       <w:r>
-        <w:t>Un integrante hace fork de https://github.com/mickldu/mimicvision-ai-2026 y agrega al resto como colaboradores. Cada uno clona el fork.</w:t>
+        <w:t>Un integrante hace fork de https://github.com/mickldu/mimicvision-ai-2026 en GitHub (boton Fork) y agrega al resto del equipo como colaboradores (Settings &gt; Collaborators del fork).</w:t>
       </w:r>
     </w:p>
     <w:p>
@@ -58,7 +63,23 @@
         <w:t xml:space="preserve">Paso 2. </w:t>
       </w:r>
       <w:r>
-        <w:t>Instalar el entorno siguiendo docs/MANUAL.md (seccion 2) y verificar con 'pytest' que los 45 tests pasan.</w:t>
+        <w:t>Cada integrante clona el fork y entra a la carpeta:</w:t>
+      </w:r>
+    </w:p>
+    <w:p>
+      <w:r>
+        <w:rPr>
+          <w:rFonts w:ascii="Consolas" w:hAnsi="Consolas"/>
+        </w:rPr>
+        <w:t>git clone https://github.com/SU-USUARIO/mimicvision-ai-2026.git</w:t>
+      </w:r>
+    </w:p>
+    <w:p>
+      <w:r>
+        <w:rPr>
+          <w:rFonts w:ascii="Consolas" w:hAnsi="Consolas"/>
+        </w:rPr>
+        <w:t>cd mimicvision-ai-2026</w:t>
       </w:r>
     </w:p>
     <w:p>
@@ -69,7 +90,31 @@
         <w:t xml:space="preserve">Paso 3. </w:t>
       </w:r>
       <w:r>
-        <w:t>Ejecutar el notebook D1_mimic_baseline.ipynb completo tal cual, con el dataset publico del docente. Anotar las metricas obtenidas: seran la linea base contra la que se compararan.</w:t>
+        <w:t>Crear y activar el entorno virtual:</w:t>
+      </w:r>
+    </w:p>
+    <w:p>
+      <w:r>
+        <w:rPr>
+          <w:rFonts w:ascii="Consolas" w:hAnsi="Consolas"/>
+        </w:rPr>
+        <w:t>python -m venv .venv</w:t>
+      </w:r>
+    </w:p>
+    <w:p>
+      <w:r>
+        <w:rPr>
+          <w:rFonts w:ascii="Consolas" w:hAnsi="Consolas"/>
+        </w:rPr>
+        <w:t>.venv\Scripts\activate        (Windows PowerShell/CMD)</w:t>
+      </w:r>
+    </w:p>
+    <w:p>
+      <w:r>
+        <w:rPr>
+          <w:rFonts w:ascii="Consolas" w:hAnsi="Consolas"/>
+        </w:rPr>
+        <w:t>source .venv/bin/activate     (Linux / macOS)</w:t>
       </w:r>
     </w:p>
     <w:p>
@@ -80,7 +125,23 @@
         <w:t xml:space="preserve">Paso 4. </w:t>
       </w:r>
       <w:r>
-        <w:t>Definir las 10 clases del equipo (pueden mantener las mismas del repositorio) con criterios observables escritos: que tiene que verse en la imagen para que sea 'zen' y no 'manos_juntas'.</w:t>
+        <w:t>Instalar PyTorch solo-CPU primero (si la maquina no tiene GPU NVIDIA) y luego el resto de dependencias:</w:t>
+      </w:r>
+    </w:p>
+    <w:p>
+      <w:r>
+        <w:rPr>
+          <w:rFonts w:ascii="Consolas" w:hAnsi="Consolas"/>
+        </w:rPr>
+        <w:t>pip install torch --index-url https://download.pytorch.org/whl/cpu</w:t>
+      </w:r>
+    </w:p>
+    <w:p>
+      <w:r>
+        <w:rPr>
+          <w:rFonts w:ascii="Consolas" w:hAnsi="Consolas"/>
+        </w:rPr>
+        <w:t>pip install -r requirements.txt</w:t>
       </w:r>
     </w:p>
     <w:p>
@@ -91,7 +152,91 @@
         <w:t xml:space="preserve">Paso 5. </w:t>
       </w:r>
       <w:r>
-        <w:t>Escribir un script de captura con webcam apoyandose en mimic/capture.py (leer_frames_de_webcam): al presionar una tecla se guarda el frame en data/images/&lt;clase&gt;/. Este script es parte del entregable.</w:t>
+        <w:t>Verificar la instalacion: 'pytest' debe terminar con 45 passed. Si algo falla aqui, revisar la seccion 7 de docs/MANUAL.md antes de continuar.</w:t>
+      </w:r>
+    </w:p>
+    <w:p>
+      <w:r>
+        <w:t>Alternativa en Google Colab: abrir el notebook de la semana desde la pestana GitHub de Colab; la primera celda clona e instala todo sola. Para la semana 3 con grounding real, activar GPU en Entorno de ejecucion &gt; Cambiar tipo.</w:t>
+      </w:r>
+    </w:p>
+    <w:p>
+      <w:pPr>
+        <w:pStyle w:val="Heading1"/>
+      </w:pPr>
+      <w:r>
+        <w:t>B. Ejecucion paso a paso</w:t>
+      </w:r>
+    </w:p>
+    <w:p>
+      <w:pPr>
+        <w:pStyle w:val="Heading2"/>
+      </w:pPr>
+      <w:r>
+        <w:t>B.1 Linea base con el dataset del docente</w:t>
+      </w:r>
+    </w:p>
+    <w:p>
+      <w:r>
+        <w:rPr>
+          <w:b/>
+        </w:rPr>
+        <w:t xml:space="preserve">Paso 1. </w:t>
+      </w:r>
+      <w:r>
+        <w:t>Abrir notebooks/D1_mimic_baseline.ipynb (en local con VS Code/Jupyter, o en Colab) y ejecutarlo completo de arriba a abajo. La primera corrida tarda 10-20 minutos: descarga el dataset publico (HaGRID + fotos CC), extrae landmarks con MediaPipe, entrena SVM vs Random Forest y evalua.</w:t>
+      </w:r>
+    </w:p>
+    <w:p>
+      <w:r>
+        <w:rPr>
+          <w:b/>
+        </w:rPr>
+        <w:t xml:space="preserve">Paso 2. </w:t>
+      </w:r>
+      <w:r>
+        <w:t>Anotar en una tabla las metricas obtenidas: modelo ganador, F1 macro de validacion, accuracy de test, F1 por clase, matriz de confusion y la tabla de latencia/FPS. Esta es la linea base del equipo.</w:t>
+      </w:r>
+    </w:p>
+    <w:p>
+      <w:r>
+        <w:rPr>
+          <w:b/>
+        </w:rPr>
+        <w:t xml:space="preserve">Paso 3. </w:t>
+      </w:r>
+      <w:r>
+        <w:t>Verificar la demo con el modelo recien entrenado: 'python -m app.app' (pestana MIMIC, camara del navegador) o 'python -m mimic.live_demo' (ventana OpenCV con FPS reales; salir con la tecla q).</w:t>
+      </w:r>
+    </w:p>
+    <w:p>
+      <w:pPr>
+        <w:pStyle w:val="Heading2"/>
+      </w:pPr>
+      <w:r>
+        <w:t>B.2 Dataset propio del equipo</w:t>
+      </w:r>
+    </w:p>
+    <w:p>
+      <w:r>
+        <w:rPr>
+          <w:b/>
+        </w:rPr>
+        <w:t xml:space="preserve">Paso 4. </w:t>
+      </w:r>
+      <w:r>
+        <w:t>Definir por escrito las 10 clases (pueden mantener las del repositorio) con criterios observables: que debe verse en la imagen para que una muestra cuente como 'zen' y no como 'manos_juntas'. Ese documento va en el informe.</w:t>
+      </w:r>
+    </w:p>
+    <w:p>
+      <w:r>
+        <w:rPr>
+          <w:b/>
+        </w:rPr>
+        <w:t xml:space="preserve">Paso 5. </w:t>
+      </w:r>
+      <w:r>
+        <w:t>Escribir un script de captura con webcam apoyandose en mimic/capture.py (funcion leer_frames_de_webcam): al presionar una tecla se guarda el frame actual en data/images/&lt;clase&gt;/. El script es parte del entregable y debe quedar en el repositorio.</w:t>
       </w:r>
     </w:p>
     <w:p>
@@ -102,7 +247,7 @@
         <w:t xml:space="preserve">Paso 6. </w:t>
       </w:r>
       <w:r>
-        <w:t>Capturar el dataset propio: minimo 100 muestras utiles por clase, minimo 3 participantes o 3 condiciones visuales distintas, evitando frames casi consecutivos del mismo gesto. Regenerar data/metadata.csv con mimic/data_curation/construir_metadata.py.</w:t>
+        <w:t>Capturar el dataset: minimo 100 muestras utiles por clase, minimo 3 participantes o 3 condiciones visuales claramente distintas (ropa, fondo, iluminacion). Evitar guardar frames casi consecutivos del mismo gesto: entre muestra y muestra hay que cambiar algo (angulo, distancia, persona).</w:t>
       </w:r>
     </w:p>
     <w:p>
@@ -113,7 +258,7 @@
         <w:t xml:space="preserve">Paso 7. </w:t>
       </w:r>
       <w:r>
-        <w:t>Borrar la cache data/features_mimic.csv y volver a ejecutar D1 completo con los datos propios.</w:t>
+        <w:t>Regenerar el inventario y el split: borrar data/metadata.csv y correr 'python -m mimic.data_curation.construir_metadata'. Verificar que la tabla de conteos por clase y split del notebook se vea balanceada.</w:t>
       </w:r>
     </w:p>
     <w:p>
@@ -124,7 +269,15 @@
         <w:t xml:space="preserve">Paso 8. </w:t>
       </w:r>
       <w:r>
-        <w:t>Comparar contra la linea base del paso 3: matriz de confusion, F1 por clase, y explicar las diferencias. Analizar 5 errores reales del conjunto de prueba.</w:t>
+        <w:t>Borrar la cache de features ('data/features_mimic.csv') y volver a ejecutar D1 completo con los datos propios.</w:t>
+      </w:r>
+    </w:p>
+    <w:p>
+      <w:pPr>
+        <w:pStyle w:val="Heading2"/>
+      </w:pPr>
+      <w:r>
+        <w:t>B.3 Comparacion y demo</w:t>
       </w:r>
     </w:p>
     <w:p>
@@ -135,7 +288,18 @@
         <w:t xml:space="preserve">Paso 9. </w:t>
       </w:r>
       <w:r>
-        <w:t>Grabar el video demo de 60 a 90 segundos mostrando las 10 clases en vivo (python -m mimic.live_demo o la pestana MIMIC de python -m app.app).</w:t>
+        <w:t>Construir la tabla comparativa linea base vs datos propios (ver seccion D) y analizar 5 errores reales del conjunto de prueba con su imagen, clase real y prediccion (la seccion 6 del notebook ya lo hace).</w:t>
+      </w:r>
+    </w:p>
+    <w:p>
+      <w:r>
+        <w:rPr>
+          <w:b/>
+        </w:rPr>
+        <w:t xml:space="preserve">Paso 10. </w:t>
+      </w:r>
+      <w:r>
+        <w:t>Grabar el video demo de 60 a 90 segundos mostrando las 5 poses y los 5 gestos en vivo con el modelo del equipo.</w:t>
       </w:r>
     </w:p>
     <w:p>
@@ -143,7 +307,7 @@
         <w:pStyle w:val="Heading1"/>
       </w:pPr>
       <w:r>
-        <w:t>Entregables (los E1-E6 del enunciado)</w:t>
+        <w:t>C. Entregables (E1-E6 del enunciado)</w:t>
       </w:r>
     </w:p>
     <w:tbl>
@@ -311,7 +475,7 @@
           </w:tcPr>
           <w:p>
             <w:r>
-              <w:t>Max. 3 paginas: incluir la comparacion datos publicos vs datos propios</w:t>
+              <w:t>Max. 3 paginas con la estructura de la seccion D</w:t>
             </w:r>
           </w:p>
         </w:tc>
@@ -322,12 +486,441 @@
         <w:pStyle w:val="Heading1"/>
       </w:pPr>
       <w:r>
-        <w:t>Criterio diferenciador de la nota</w:t>
+        <w:t>D. Informe: estructura obligatoria y metricas</w:t>
       </w:r>
     </w:p>
     <w:p>
       <w:r>
-        <w:t>La comparacion honesta entre la linea base (dataset publico del docente) y el sistema con datos propios es lo que distingue un trabajo excelente: no basta reportar el F1 final, hay que explicar por que cambio y que clases mejoraron o empeoraron y por que.</w:t>
+        <w:t>El informe (max. 3 paginas) debe tener estas secciones:</w:t>
+      </w:r>
+    </w:p>
+    <w:p>
+      <w:pPr>
+        <w:pStyle w:val="ListNumber"/>
+      </w:pPr>
+      <w:r>
+        <w:t>Problema y definicion de clases: las 10 clases con sus criterios observables.</w:t>
+      </w:r>
+    </w:p>
+    <w:p>
+      <w:pPr>
+        <w:pStyle w:val="ListNumber"/>
+      </w:pPr>
+      <w:r>
+        <w:t>Protocolo de captura: cuantas muestras, cuantos participantes, condiciones, y como se evito el sesgo de frames consecutivos.</w:t>
+      </w:r>
+    </w:p>
+    <w:p>
+      <w:pPr>
+        <w:pStyle w:val="ListNumber"/>
+      </w:pPr>
+      <w:r>
+        <w:t>Metodo: solo lo que el equipo cambio respecto al pipeline de referencia.</w:t>
+      </w:r>
+    </w:p>
+    <w:p>
+      <w:pPr>
+        <w:pStyle w:val="ListNumber"/>
+      </w:pPr>
+      <w:r>
+        <w:t>Resultados: la tabla comparativa de abajo, la matriz de confusion propia y la tabla de latencia/FPS.</w:t>
+      </w:r>
+    </w:p>
+    <w:p>
+      <w:pPr>
+        <w:pStyle w:val="ListNumber"/>
+      </w:pPr>
+      <w:r>
+        <w:t>Analisis de 5 errores reales con imagen, causa probable y accion concreta para reducirlos.</w:t>
+      </w:r>
+    </w:p>
+    <w:p>
+      <w:pPr>
+        <w:pStyle w:val="ListNumber"/>
+      </w:pPr>
+      <w:r>
+        <w:t>Respuestas a las preguntas finales (seccion E).</w:t>
+      </w:r>
+    </w:p>
+    <w:p>
+      <w:r>
+        <w:t>Tabla comparativa obligatoria (los valores de referencia salen de docs/informe_D1_mimic.md y son la linea base a superar):</w:t>
+      </w:r>
+    </w:p>
+    <w:tbl>
+      <w:tblPr>
+        <w:tblStyle w:val="LightGrid-Accent1"/>
+        <w:tblW w:type="auto" w:w="0"/>
+        <w:tblLook w:firstColumn="1" w:firstRow="1" w:lastColumn="0" w:lastRow="0" w:noHBand="0" w:noVBand="1" w:val="04A0"/>
+      </w:tblPr>
+      <w:tblGrid>
+        <w:gridCol w:w="2160"/>
+        <w:gridCol w:w="2160"/>
+        <w:gridCol w:w="2160"/>
+        <w:gridCol w:w="2160"/>
+      </w:tblGrid>
+      <w:tr>
+        <w:tc>
+          <w:tcPr>
+            <w:tcW w:type="dxa" w:w="2160"/>
+          </w:tcPr>
+          <w:p>
+            <w:r>
+              <w:rPr>
+                <w:b/>
+              </w:rPr>
+              <w:t>Metrica</w:t>
+            </w:r>
+          </w:p>
+        </w:tc>
+        <w:tc>
+          <w:tcPr>
+            <w:tcW w:type="dxa" w:w="2160"/>
+          </w:tcPr>
+          <w:p>
+            <w:r>
+              <w:rPr>
+                <w:b/>
+              </w:rPr>
+              <w:t>Referencia (docente)</w:t>
+            </w:r>
+          </w:p>
+        </w:tc>
+        <w:tc>
+          <w:tcPr>
+            <w:tcW w:type="dxa" w:w="2160"/>
+          </w:tcPr>
+          <w:p>
+            <w:r>
+              <w:rPr>
+                <w:b/>
+              </w:rPr>
+              <w:t>Equipo (linea base)</w:t>
+            </w:r>
+          </w:p>
+        </w:tc>
+        <w:tc>
+          <w:tcPr>
+            <w:tcW w:type="dxa" w:w="2160"/>
+          </w:tcPr>
+          <w:p>
+            <w:r>
+              <w:rPr>
+                <w:b/>
+              </w:rPr>
+              <w:t>Equipo (datos propios)</w:t>
+            </w:r>
+          </w:p>
+        </w:tc>
+      </w:tr>
+      <w:tr>
+        <w:tc>
+          <w:tcPr>
+            <w:tcW w:type="dxa" w:w="2160"/>
+          </w:tcPr>
+          <w:p>
+            <w:r>
+              <w:t>Muestras totales / utiles</w:t>
+            </w:r>
+          </w:p>
+        </w:tc>
+        <w:tc>
+          <w:tcPr>
+            <w:tcW w:type="dxa" w:w="2160"/>
+          </w:tcPr>
+          <w:p>
+            <w:r>
+              <w:t>330 / 275 (83.3% deteccion)</w:t>
+            </w:r>
+          </w:p>
+        </w:tc>
+        <w:tc>
+          <w:tcPr>
+            <w:tcW w:type="dxa" w:w="2160"/>
+          </w:tcPr>
+          <w:p>
+            <w:r/>
+          </w:p>
+        </w:tc>
+        <w:tc>
+          <w:tcPr>
+            <w:tcW w:type="dxa" w:w="2160"/>
+          </w:tcPr>
+          <w:p>
+            <w:r/>
+          </w:p>
+        </w:tc>
+      </w:tr>
+      <w:tr>
+        <w:tc>
+          <w:tcPr>
+            <w:tcW w:type="dxa" w:w="2160"/>
+          </w:tcPr>
+          <w:p>
+            <w:r>
+              <w:t>Modelo ganador</w:t>
+            </w:r>
+          </w:p>
+        </w:tc>
+        <w:tc>
+          <w:tcPr>
+            <w:tcW w:type="dxa" w:w="2160"/>
+          </w:tcPr>
+          <w:p>
+            <w:r>
+              <w:t>Random Forest</w:t>
+            </w:r>
+          </w:p>
+        </w:tc>
+        <w:tc>
+          <w:tcPr>
+            <w:tcW w:type="dxa" w:w="2160"/>
+          </w:tcPr>
+          <w:p>
+            <w:r/>
+          </w:p>
+        </w:tc>
+        <w:tc>
+          <w:tcPr>
+            <w:tcW w:type="dxa" w:w="2160"/>
+          </w:tcPr>
+          <w:p>
+            <w:r/>
+          </w:p>
+        </w:tc>
+      </w:tr>
+      <w:tr>
+        <w:tc>
+          <w:tcPr>
+            <w:tcW w:type="dxa" w:w="2160"/>
+          </w:tcPr>
+          <w:p>
+            <w:r>
+              <w:t>F1 macro (validacion cruzada)</w:t>
+            </w:r>
+          </w:p>
+        </w:tc>
+        <w:tc>
+          <w:tcPr>
+            <w:tcW w:type="dxa" w:w="2160"/>
+          </w:tcPr>
+          <w:p>
+            <w:r>
+              <w:t>0.326</w:t>
+            </w:r>
+          </w:p>
+        </w:tc>
+        <w:tc>
+          <w:tcPr>
+            <w:tcW w:type="dxa" w:w="2160"/>
+          </w:tcPr>
+          <w:p>
+            <w:r/>
+          </w:p>
+        </w:tc>
+        <w:tc>
+          <w:tcPr>
+            <w:tcW w:type="dxa" w:w="2160"/>
+          </w:tcPr>
+          <w:p>
+            <w:r/>
+          </w:p>
+        </w:tc>
+      </w:tr>
+      <w:tr>
+        <w:tc>
+          <w:tcPr>
+            <w:tcW w:type="dxa" w:w="2160"/>
+          </w:tcPr>
+          <w:p>
+            <w:r>
+              <w:t>Accuracy en test</w:t>
+            </w:r>
+          </w:p>
+        </w:tc>
+        <w:tc>
+          <w:tcPr>
+            <w:tcW w:type="dxa" w:w="2160"/>
+          </w:tcPr>
+          <w:p>
+            <w:r>
+              <w:t>0.62</w:t>
+            </w:r>
+          </w:p>
+        </w:tc>
+        <w:tc>
+          <w:tcPr>
+            <w:tcW w:type="dxa" w:w="2160"/>
+          </w:tcPr>
+          <w:p>
+            <w:r/>
+          </w:p>
+        </w:tc>
+        <w:tc>
+          <w:tcPr>
+            <w:tcW w:type="dxa" w:w="2160"/>
+          </w:tcPr>
+          <w:p>
+            <w:r/>
+          </w:p>
+        </w:tc>
+      </w:tr>
+      <w:tr>
+        <w:tc>
+          <w:tcPr>
+            <w:tcW w:type="dxa" w:w="2160"/>
+          </w:tcPr>
+          <w:p>
+            <w:r>
+              <w:t>F1 clase mas fuerte</w:t>
+            </w:r>
+          </w:p>
+        </w:tc>
+        <w:tc>
+          <w:tcPr>
+            <w:tcW w:type="dxa" w:w="2160"/>
+          </w:tcPr>
+          <w:p>
+            <w:r>
+              <w:t>saludo: 0.76</w:t>
+            </w:r>
+          </w:p>
+        </w:tc>
+        <w:tc>
+          <w:tcPr>
+            <w:tcW w:type="dxa" w:w="2160"/>
+          </w:tcPr>
+          <w:p>
+            <w:r/>
+          </w:p>
+        </w:tc>
+        <w:tc>
+          <w:tcPr>
+            <w:tcW w:type="dxa" w:w="2160"/>
+          </w:tcPr>
+          <w:p>
+            <w:r/>
+          </w:p>
+        </w:tc>
+      </w:tr>
+      <w:tr>
+        <w:tc>
+          <w:tcPr>
+            <w:tcW w:type="dxa" w:w="2160"/>
+          </w:tcPr>
+          <w:p>
+            <w:r>
+              <w:t>Clases con F1 = 0.00</w:t>
+            </w:r>
+          </w:p>
+        </w:tc>
+        <w:tc>
+          <w:tcPr>
+            <w:tcW w:type="dxa" w:w="2160"/>
+          </w:tcPr>
+          <w:p>
+            <w:r>
+              <w:t>6 de 10 (test de 1-2 muestras)</w:t>
+            </w:r>
+          </w:p>
+        </w:tc>
+        <w:tc>
+          <w:tcPr>
+            <w:tcW w:type="dxa" w:w="2160"/>
+          </w:tcPr>
+          <w:p>
+            <w:r/>
+          </w:p>
+        </w:tc>
+        <w:tc>
+          <w:tcPr>
+            <w:tcW w:type="dxa" w:w="2160"/>
+          </w:tcPr>
+          <w:p>
+            <w:r/>
+          </w:p>
+        </w:tc>
+      </w:tr>
+      <w:tr>
+        <w:tc>
+          <w:tcPr>
+            <w:tcW w:type="dxa" w:w="2160"/>
+          </w:tcPr>
+          <w:p>
+            <w:r>
+              <w:t>Latencia media / p95</w:t>
+            </w:r>
+          </w:p>
+        </w:tc>
+        <w:tc>
+          <w:tcPr>
+            <w:tcW w:type="dxa" w:w="2160"/>
+          </w:tcPr>
+          <w:p>
+            <w:r>
+              <w:t>30.7 ms / 41.4 ms</w:t>
+            </w:r>
+          </w:p>
+        </w:tc>
+        <w:tc>
+          <w:tcPr>
+            <w:tcW w:type="dxa" w:w="2160"/>
+          </w:tcPr>
+          <w:p>
+            <w:r/>
+          </w:p>
+        </w:tc>
+        <w:tc>
+          <w:tcPr>
+            <w:tcW w:type="dxa" w:w="2160"/>
+          </w:tcPr>
+          <w:p>
+            <w:r/>
+          </w:p>
+        </w:tc>
+      </w:tr>
+      <w:tr>
+        <w:tc>
+          <w:tcPr>
+            <w:tcW w:type="dxa" w:w="2160"/>
+          </w:tcPr>
+          <w:p>
+            <w:r>
+              <w:t>FPS estimados (CPU)</w:t>
+            </w:r>
+          </w:p>
+        </w:tc>
+        <w:tc>
+          <w:tcPr>
+            <w:tcW w:type="dxa" w:w="2160"/>
+          </w:tcPr>
+          <w:p>
+            <w:r>
+              <w:t>32.5</w:t>
+            </w:r>
+          </w:p>
+        </w:tc>
+        <w:tc>
+          <w:tcPr>
+            <w:tcW w:type="dxa" w:w="2160"/>
+          </w:tcPr>
+          <w:p>
+            <w:r/>
+          </w:p>
+        </w:tc>
+        <w:tc>
+          <w:tcPr>
+            <w:tcW w:type="dxa" w:w="2160"/>
+          </w:tcPr>
+          <w:p>
+            <w:r/>
+          </w:p>
+        </w:tc>
+      </w:tr>
+    </w:tbl>
+    <w:p>
+      <w:r>
+        <w:t>Las columnas 'Equipo (linea base)' y 'Equipo (datos propios)' las llena el equipo: la primera al repetir el notebook con el dataset del docente en su maquina, la segunda con su propio dataset. Las tres columnas juntas separan el efecto del hardware del efecto de los datos.</w:t>
       </w:r>
     </w:p>
     <w:p>
@@ -335,7 +928,95 @@
         <w:pStyle w:val="Heading1"/>
       </w:pPr>
       <w:r>
-        <w:t>Reglas de integridad (aplican todas las semanas)</w:t>
+        <w:t>E. Preguntas finales (responder en el informe y defender en clase)</w:t>
+      </w:r>
+    </w:p>
+    <w:p>
+      <w:pPr>
+        <w:pStyle w:val="ListNumber"/>
+      </w:pPr>
+      <w:r>
+        <w:t>Por que el proyecto selecciona el modelo por F1 macro y no por accuracy? Que pasaria con un dataset como el de referencia (120 muestras de saludo, 7 de manos_juntas) si se usara accuracy?</w:t>
+      </w:r>
+    </w:p>
+    <w:p>
+      <w:pPr>
+        <w:pStyle w:val="ListNumber"/>
+      </w:pPr>
+      <w:r>
+        <w:t>Por que las 10 features se normalizan por el ancho de hombros? Que fallaria si se usaran distancias en pixeles crudos?</w:t>
+      </w:r>
+    </w:p>
+    <w:p>
+      <w:pPr>
+        <w:pStyle w:val="ListNumber"/>
+      </w:pPr>
+      <w:r>
+        <w:t>El modelo de referencia clasifica casi todo como pulgar_arriba o saludo. Expliquen la causa raiz y como su protocolo de captura la ataca.</w:t>
+      </w:r>
+    </w:p>
+    <w:p>
+      <w:pPr>
+        <w:pStyle w:val="ListNumber"/>
+      </w:pPr>
+      <w:r>
+        <w:t>Que feature nueva propondrian para separar 'pensando' de 'mano_en_menton', que comparten geometria de mano cerca de la cara? Justificar con los landmarks disponibles.</w:t>
+      </w:r>
+    </w:p>
+    <w:p>
+      <w:pPr>
+        <w:pStyle w:val="ListNumber"/>
+      </w:pPr>
+      <w:r>
+        <w:t>Su F1 con datos propios, es directamente comparable con el del docente? Que condiciones tendrian que igualarse para que la comparacion fuera justa?</w:t>
+      </w:r>
+    </w:p>
+    <w:p>
+      <w:pPr>
+        <w:pStyle w:val="Heading1"/>
+      </w:pPr>
+      <w:r>
+        <w:t>F. Mejoras sugeridas para la practica (opcionales, suben nota)</w:t>
+      </w:r>
+    </w:p>
+    <w:p>
+      <w:pPr>
+        <w:pStyle w:val="ListBullet"/>
+      </w:pPr>
+      <w:r>
+        <w:t>Balanceo por pesos: entrenar con class_weight='balanced' en SVM y Random Forest y medir si reduce el sesgo hacia las clases grandes. Reportar antes/despues.</w:t>
+      </w:r>
+    </w:p>
+    <w:p>
+      <w:pPr>
+        <w:pStyle w:val="ListBullet"/>
+      </w:pPr>
+      <w:r>
+        <w:t>Features de manos: agregar features desde los hand landmarks de MediaPipe Holistic (por ejemplo, extension de dedos) para separar senalamiento de saludo. El detector ya los entrega; el proyecto de referencia no los usa.</w:t>
+      </w:r>
+    </w:p>
+    <w:p>
+      <w:pPr>
+        <w:pStyle w:val="ListBullet"/>
+      </w:pPr>
+      <w:r>
+        <w:t>Aumento de datos medido: aplicar flip horizontal y cambios de brillo SOLO al conjunto de entrenamiento, y reportar el efecto real sobre el F1 de test (no asumirlo).</w:t>
+      </w:r>
+    </w:p>
+    <w:p>
+      <w:pPr>
+        <w:pStyle w:val="ListBullet"/>
+      </w:pPr>
+      <w:r>
+        <w:t>Curva de aprendizaje: entrenar con 25%, 50%, 75% y 100% de sus datos y graficar F1 vs tamano del dataset -- evidencia directa de cuanto valen los datos que capturaron.</w:t>
+      </w:r>
+    </w:p>
+    <w:p>
+      <w:pPr>
+        <w:pStyle w:val="Heading1"/>
+      </w:pPr>
+      <w:r>
+        <w:t>G. Reglas de integridad (aplican todas las semanas)</w:t>
       </w:r>
     </w:p>
     <w:p>

</xml_diff>

<commit_message>
Simplificar el protocolo de datos: un solo video del grupo con los gestos
En vez de capturar fotos individuales con un script de webcam, cada
equipo graba UN video de 3-5 minutos donde cada integrante sostiene
las 10 clases por turnos. Ese unico artefacto alimenta las tres
semanas: frames muestreados a 2-3 FPS por segmento anotado para el
dataset (semana 1), la galeria (semana 2) y el video de prueba del
timeline con su anotacion como verdad de terreno (semana 3).

Dos reglas metodologicas quedan explicitas en los documentos: el
split train/val/test se hace por segmento (nunca frame a frame, o el
test queda contaminado por frames casi identicos), y en la semana 3
la tasa de acierto de eventos se reporta separada entre segmentos de
train y de test, porque el mismo video entreno al clasificador.

El video se entrega enlazado en el README (Drive o YouTube no
listado); solo el CSV de anotacion de segmentos entra a git.

Co-Authored-By: Claude Fable 5 <noreply@anthropic.com>
</commit_message>
<xml_diff>
--- a/docs/instrucciones/Instrucciones_Semana_1_MIMIC.docx
+++ b/docs/instrucciones/Instrucciones_Semana_1_MIMIC.docx
@@ -214,7 +214,12 @@
         <w:pStyle w:val="Heading2"/>
       </w:pPr>
       <w:r>
-        <w:t>B.2 Dataset propio del equipo</w:t>
+        <w:t>B.2 El video del grupo (la unica captura que hace el equipo)</w:t>
+      </w:r>
+    </w:p>
+    <w:p>
+      <w:r>
+        <w:t>Todo el dato propio del proyecto sale de UN solo video grabado por el grupo. Ese mismo video se reutiliza las tres semanas: esta semana como fuente del dataset de entrenamiento, la semana 2 como fuente de la galeria, y la semana 3 como video de prueba del timeline. Grabenlo bien una vez y no vuelven a capturar nada.</w:t>
       </w:r>
     </w:p>
     <w:p>
@@ -236,7 +241,7 @@
         <w:t xml:space="preserve">Paso 5. </w:t>
       </w:r>
       <w:r>
-        <w:t>Escribir un script de captura con webcam apoyandose en mimic/capture.py (funcion leer_frames_de_webcam): al presionar una tecla se guarda el frame actual en data/images/&lt;clase&gt;/. El script es parte del entregable y debe quedar en el repositorio.</w:t>
+        <w:t>Grabar el video del grupo: 3 a 5 minutos, camara fija, cuerpo visible de la cintura hacia arriba. Cada integrante pasa al frente y sostiene cada una de las 10 clases durante 8-10 segundos, en orden anunciado. Con 3 integrantes eso da ~30 segmentos y sobra material para las 100 muestras por clase.</w:t>
       </w:r>
     </w:p>
     <w:p>
@@ -247,7 +252,7 @@
         <w:t xml:space="preserve">Paso 6. </w:t>
       </w:r>
       <w:r>
-        <w:t>Capturar el dataset: minimo 100 muestras utiles por clase, minimo 3 participantes o 3 condiciones visuales claramente distintas (ropa, fondo, iluminacion). Evitar guardar frames casi consecutivos del mismo gesto: entre muestra y muestra hay que cambiar algo (angulo, distancia, persona).</w:t>
+        <w:t>Anotar los segmentos en un CSV (clase, integrante, inicio_s, fin_s) con el mismo formato que data/videos/video_prueba_registro.csv. Diez minutos de trabajo que sirven para las tres semanas.</w:t>
       </w:r>
     </w:p>
     <w:p>
@@ -258,7 +263,7 @@
         <w:t xml:space="preserve">Paso 7. </w:t>
       </w:r>
       <w:r>
-        <w:t>Regenerar el inventario y el split: borrar data/metadata.csv y correr 'python -m mimic.data_curation.construir_metadata'. Verificar que la tabla de conteos por clase y split del notebook se vea balanceada.</w:t>
+        <w:t>Extraer los frames del video con un script propio apoyado en ask/ingest.py (muestrear_frames_de_video): muestrear a 2-3 FPS dentro de cada segmento anotado y guardar en data/images/&lt;clase&gt;/. A 2 FPS, un segmento de 10 segundos da 20 muestras variadas; NO usar el FPS completo del video, porque frames consecutivos son casi identicos y inflan las metricas.</w:t>
       </w:r>
     </w:p>
     <w:p>
@@ -269,15 +274,7 @@
         <w:t xml:space="preserve">Paso 8. </w:t>
       </w:r>
       <w:r>
-        <w:t>Borrar la cache de features ('data/features_mimic.csv') y volver a ejecutar D1 completo con los datos propios.</w:t>
-      </w:r>
-    </w:p>
-    <w:p>
-      <w:pPr>
-        <w:pStyle w:val="Heading2"/>
-      </w:pPr>
-      <w:r>
-        <w:t>B.3 Comparacion y demo</w:t>
+        <w:t>Regla critica del split: el reparto train/val/test debe hacerse POR SEGMENTO (o por integrante), nunca frame a frame. Si frames del mismo segmento caen en train y en test a la vez, el test queda contaminado y el F1 sale artificialmente alto -- es el error metodologico que mas descuenta.</w:t>
       </w:r>
     </w:p>
     <w:p>
@@ -288,7 +285,15 @@
         <w:t xml:space="preserve">Paso 9. </w:t>
       </w:r>
       <w:r>
-        <w:t>Construir la tabla comparativa linea base vs datos propios (ver seccion D) y analizar 5 errores reales del conjunto de prueba con su imagen, clase real y prediccion (la seccion 6 del notebook ya lo hace).</w:t>
+        <w:t>Regenerar el inventario ('python -m mimic.data_curation.construir_metadata' o su propio script si implementaron el split por segmento), borrar la cache data/features_mimic.csv y volver a ejecutar D1 completo con los datos propios.</w:t>
+      </w:r>
+    </w:p>
+    <w:p>
+      <w:pPr>
+        <w:pStyle w:val="Heading2"/>
+      </w:pPr>
+      <w:r>
+        <w:t>B.3 Comparacion y entrega</w:t>
       </w:r>
     </w:p>
     <w:p>
@@ -299,7 +304,18 @@
         <w:t xml:space="preserve">Paso 10. </w:t>
       </w:r>
       <w:r>
-        <w:t>Grabar el video demo de 60 a 90 segundos mostrando las 5 poses y los 5 gestos en vivo con el modelo del equipo.</w:t>
+        <w:t>Construir la tabla comparativa linea base vs datos propios (ver seccion D) y analizar 5 errores reales del conjunto de prueba con su imagen, clase real y prediccion (la seccion 6 del notebook ya lo hace).</w:t>
+      </w:r>
+    </w:p>
+    <w:p>
+      <w:r>
+        <w:rPr>
+          <w:b/>
+        </w:rPr>
+        <w:t xml:space="preserve">Paso 11. </w:t>
+      </w:r>
+      <w:r>
+        <w:t>Subir el video del grupo a Drive o YouTube (no listado) y enlazarlo en el README del fork -- el video no entra a git por peso. El CSV de anotacion de segmentos SI se sube al repositorio.</w:t>
       </w:r>
     </w:p>
     <w:p>
@@ -409,7 +425,7 @@
           </w:tcPr>
           <w:p>
             <w:r>
-              <w:t>features_mimic.csv propio + diccionario de variables</w:t>
+              <w:t>features_mimic.csv propio + CSV de anotacion de segmentos del video</w:t>
             </w:r>
           </w:p>
         </w:tc>
@@ -443,7 +459,7 @@
           </w:tcPr>
           <w:p>
             <w:r>
-              <w:t>E5 Video demo</w:t>
+              <w:t>E5 Video del grupo</w:t>
             </w:r>
           </w:p>
         </w:tc>
@@ -453,7 +469,7 @@
           </w:tcPr>
           <w:p>
             <w:r>
-              <w:t>60-90 s con las 5 poses y los 5 gestos en vivo</w:t>
+              <w:t>3-5 min con los 10 gestos por integrante, enlazado en el README (Drive o YouTube no listado)</w:t>
             </w:r>
           </w:p>
         </w:tc>

</xml_diff>